<commit_message>
Gunakan tautan produksi Vercel pada laporan dan presentasi
Tautan lama menunjuk ke satu deployment tetap yang masih memuat tampilan
versi sebelumnya.
</commit_message>
<xml_diff>
--- a/laporan/Laporan-K1-Playfair-Cipher.docx
+++ b/laporan/Laporan-K1-Playfair-Cipher.docx
@@ -1365,7 +1365,7 @@
           <w:rPr>
             <w:rStyle w:val="Hyperlink"/>
           </w:rPr>
-          <w:t xml:space="preserve">https://ki-k1-fw4qxggdu-afdha5678s-projects.vercel.app</w:t>
+          <w:t xml:space="preserve">https://ki-k1.vercel.app</w:t>
         </w:r>
       </w:hyperlink>
       <w:r>
@@ -8899,7 +8899,7 @@
                 <w:rPr>
                   <w:rStyle w:val="Hyperlink"/>
                 </w:rPr>
-                <w:t xml:space="preserve">https://ki-k1-fw4qxggdu-afdha5678s-projects.vercel.app</w:t>
+                <w:t xml:space="preserve">https://ki-k1.vercel.app</w:t>
               </w:r>
             </w:hyperlink>
           </w:p>

</xml_diff>